<commit_message>
Sprint4 - feat: Atualizando Word de Projeto de Software
</commit_message>
<xml_diff>
--- a/docs/GymPro.docx
+++ b/docs/GymPro.docx
@@ -1601,107 +1601,115 @@
     </w:p>
     <w:p>
       <w:pPr>
+        <w:spacing w:after="0" w:line="360" w:lineRule="auto"/>
+        <w:ind w:left="357" w:firstLine="709"/>
+        <w:jc w:val="both"/>
+        <w:rPr>
+          <w:rFonts w:ascii="Arial" w:hAnsi="Arial" w:cs="Arial"/>
+        </w:rPr>
+      </w:pPr>
+      <w:r>
+        <w:rPr>
+          <w:rFonts w:ascii="Arial" w:hAnsi="Arial" w:cs="Arial"/>
+        </w:rPr>
+        <w:t xml:space="preserve">Com base na análise dos sites das academias </w:t>
+      </w:r>
+      <w:proofErr w:type="spellStart"/>
+      <w:r>
+        <w:rPr>
+          <w:rFonts w:ascii="Arial" w:hAnsi="Arial" w:cs="Arial"/>
+        </w:rPr>
+        <w:t>Smart</w:t>
+      </w:r>
+      <w:proofErr w:type="spellEnd"/>
+      <w:r>
+        <w:rPr>
+          <w:rFonts w:ascii="Arial" w:hAnsi="Arial" w:cs="Arial"/>
+        </w:rPr>
+        <w:t xml:space="preserve"> Fit, </w:t>
+      </w:r>
+      <w:proofErr w:type="spellStart"/>
+      <w:r>
+        <w:rPr>
+          <w:rFonts w:ascii="Arial" w:hAnsi="Arial" w:cs="Arial"/>
+        </w:rPr>
+        <w:t>Skyfit</w:t>
+      </w:r>
+      <w:proofErr w:type="spellEnd"/>
+      <w:r>
+        <w:rPr>
+          <w:rFonts w:ascii="Arial" w:hAnsi="Arial" w:cs="Arial"/>
+        </w:rPr>
+        <w:t xml:space="preserve"> e </w:t>
+      </w:r>
+      <w:proofErr w:type="spellStart"/>
+      <w:r>
+        <w:rPr>
+          <w:rFonts w:ascii="Arial" w:hAnsi="Arial" w:cs="Arial"/>
+        </w:rPr>
+        <w:t>Ironberg</w:t>
+      </w:r>
+      <w:proofErr w:type="spellEnd"/>
+      <w:r>
+        <w:rPr>
+          <w:rFonts w:ascii="Arial" w:hAnsi="Arial" w:cs="Arial"/>
+        </w:rPr>
+        <w:t xml:space="preserve">, foi possível identificar características importantes para o desenvolvimento do sistema </w:t>
+      </w:r>
+      <w:proofErr w:type="spellStart"/>
+      <w:r>
+        <w:rPr>
+          <w:rFonts w:ascii="Arial" w:hAnsi="Arial" w:cs="Arial"/>
+        </w:rPr>
+        <w:t>GymPro</w:t>
+      </w:r>
+      <w:proofErr w:type="spellEnd"/>
+      <w:r>
+        <w:rPr>
+          <w:rFonts w:ascii="Arial" w:hAnsi="Arial" w:cs="Arial"/>
+        </w:rPr>
+        <w:t xml:space="preserve">. Entre os pontos positivos observados, destacam-se a clareza na apresentação dos planos, facilidade de navegação e disponibilidade de informações para o público. Por outro lado, foram identificados problemas relacionados à acessibilidade, instabilidade das páginas e ausência de informações completas sobre unidades e matrícula. Dessa forma, o grupo decidiu que o sistema </w:t>
+      </w:r>
+      <w:proofErr w:type="spellStart"/>
+      <w:r>
+        <w:rPr>
+          <w:rFonts w:ascii="Arial" w:hAnsi="Arial" w:cs="Arial"/>
+        </w:rPr>
+        <w:t>GymPro</w:t>
+      </w:r>
+      <w:proofErr w:type="spellEnd"/>
+      <w:r>
+        <w:rPr>
+          <w:rFonts w:ascii="Arial" w:hAnsi="Arial" w:cs="Arial"/>
+        </w:rPr>
+        <w:t xml:space="preserve"> deverá priorizar uma interface simples e intuitiva, cadastro </w:t>
+      </w:r>
+      <w:r>
+        <w:rPr>
+          <w:rFonts w:ascii="Arial" w:hAnsi="Arial" w:cs="Arial"/>
+        </w:rPr>
+        <w:lastRenderedPageBreak/>
+        <w:t>rápido de alunos, visualização clara dos planos e estabilidade durante a navegação, evitando elementos confusos ou excessivamente complexos.</w:t>
+      </w:r>
+    </w:p>
+    <w:p>
+      <w:pPr>
+        <w:tabs>
+          <w:tab w:val="left" w:pos="2993"/>
+        </w:tabs>
         <w:ind w:left="360"/>
         <w:rPr>
           <w:rFonts w:ascii="Arial" w:hAnsi="Arial" w:cs="Arial"/>
-        </w:rPr>
-      </w:pPr>
-      <w:r>
-        <w:rPr>
-          <w:rFonts w:ascii="Arial" w:hAnsi="Arial" w:cs="Arial"/>
-        </w:rPr>
-        <w:t xml:space="preserve">Com base na análise dos sites das academias </w:t>
-      </w:r>
-      <w:proofErr w:type="spellStart"/>
-      <w:r>
-        <w:rPr>
-          <w:rFonts w:ascii="Arial" w:hAnsi="Arial" w:cs="Arial"/>
-        </w:rPr>
-        <w:t>Smart</w:t>
-      </w:r>
-      <w:proofErr w:type="spellEnd"/>
-      <w:r>
-        <w:rPr>
-          <w:rFonts w:ascii="Arial" w:hAnsi="Arial" w:cs="Arial"/>
-        </w:rPr>
-        <w:t xml:space="preserve"> Fit, </w:t>
-      </w:r>
-      <w:proofErr w:type="spellStart"/>
-      <w:r>
-        <w:rPr>
-          <w:rFonts w:ascii="Arial" w:hAnsi="Arial" w:cs="Arial"/>
-        </w:rPr>
-        <w:t>Skyfit</w:t>
-      </w:r>
-      <w:proofErr w:type="spellEnd"/>
-      <w:r>
-        <w:rPr>
-          <w:rFonts w:ascii="Arial" w:hAnsi="Arial" w:cs="Arial"/>
-        </w:rPr>
-        <w:t xml:space="preserve"> e </w:t>
-      </w:r>
-      <w:proofErr w:type="spellStart"/>
-      <w:r>
-        <w:rPr>
-          <w:rFonts w:ascii="Arial" w:hAnsi="Arial" w:cs="Arial"/>
-        </w:rPr>
-        <w:t>Ironberg</w:t>
-      </w:r>
-      <w:proofErr w:type="spellEnd"/>
-      <w:r>
-        <w:rPr>
-          <w:rFonts w:ascii="Arial" w:hAnsi="Arial" w:cs="Arial"/>
-        </w:rPr>
-        <w:t xml:space="preserve">, foi possível identificar características importantes para o desenvolvimento do sistema </w:t>
-      </w:r>
-      <w:proofErr w:type="spellStart"/>
-      <w:r>
-        <w:rPr>
-          <w:rFonts w:ascii="Arial" w:hAnsi="Arial" w:cs="Arial"/>
-        </w:rPr>
-        <w:t>GymPro</w:t>
-      </w:r>
-      <w:proofErr w:type="spellEnd"/>
-      <w:r>
-        <w:rPr>
-          <w:rFonts w:ascii="Arial" w:hAnsi="Arial" w:cs="Arial"/>
-        </w:rPr>
-        <w:t xml:space="preserve">. Entre os pontos positivos observados, destacam-se a clareza na apresentação dos planos, facilidade de navegação e disponibilidade de informações para o público. Por outro lado, foram identificados problemas relacionados à acessibilidade, instabilidade das páginas e ausência de informações completas sobre unidades e matrícula. Dessa forma, o grupo decidiu que o sistema </w:t>
-      </w:r>
-      <w:proofErr w:type="spellStart"/>
-      <w:r>
-        <w:rPr>
-          <w:rFonts w:ascii="Arial" w:hAnsi="Arial" w:cs="Arial"/>
-        </w:rPr>
-        <w:t>GymPro</w:t>
-      </w:r>
-      <w:proofErr w:type="spellEnd"/>
-      <w:r>
-        <w:rPr>
-          <w:rFonts w:ascii="Arial" w:hAnsi="Arial" w:cs="Arial"/>
-        </w:rPr>
-        <w:t xml:space="preserve"> deverá priorizar uma interface simples e intuitiva, cadastro rápido de alunos, visualização clara dos planos e estabilidade durante a navegação, evitando elementos confusos ou excessivamente complexos.</w:t>
-      </w:r>
-    </w:p>
-    <w:p>
-      <w:pPr>
-        <w:tabs>
-          <w:tab w:val="left" w:pos="2993"/>
-        </w:tabs>
-        <w:ind w:left="360"/>
-        <w:rPr>
-          <w:rFonts w:ascii="Arial" w:hAnsi="Arial" w:cs="Arial"/>
-          <w:b/>
-          <w:bCs/>
-        </w:rPr>
-      </w:pPr>
-      <w:r>
-        <w:rPr>
-          <w:rFonts w:ascii="Arial" w:hAnsi="Arial" w:cs="Arial"/>
-          <w:b/>
-          <w:bCs/>
-        </w:rPr>
-        <w:lastRenderedPageBreak/>
+          <w:b/>
+          <w:bCs/>
+        </w:rPr>
+      </w:pPr>
+      <w:r>
+        <w:rPr>
+          <w:rFonts w:ascii="Arial" w:hAnsi="Arial" w:cs="Arial"/>
+          <w:b/>
+          <w:bCs/>
+        </w:rPr>
         <w:t>1)</w:t>
       </w:r>
       <w:r>
@@ -1947,7 +1955,15 @@
           <w:b/>
           <w:bCs/>
         </w:rPr>
-        <w:t xml:space="preserve"> – Matrícula só pode ser concluída com cadastro completo</w:t>
+        <w:t xml:space="preserve"> – Matrícula </w:t>
+      </w:r>
+      <w:r>
+        <w:rPr>
+          <w:rFonts w:ascii="Arial" w:hAnsi="Arial" w:cs="Arial"/>
+          <w:b/>
+          <w:bCs/>
+        </w:rPr>
+        <w:t xml:space="preserve">requer cadastro completo, plano ativo e vaga disponível </w:t>
       </w:r>
     </w:p>
     <w:p>
@@ -1970,21 +1986,13 @@
           <w:rFonts w:ascii="Arial" w:hAnsi="Arial" w:cs="Arial"/>
         </w:rPr>
         <w:br/>
-        <w:t xml:space="preserve">A matrícula só poderá ser finalizada se </w:t>
-      </w:r>
-      <w:r>
-        <w:rPr>
-          <w:rFonts w:ascii="Arial" w:hAnsi="Arial" w:cs="Arial"/>
-          <w:b/>
-          <w:bCs/>
-        </w:rPr>
-        <w:t>todos os dados obrigatórios do aluno</w:t>
-      </w:r>
-      <w:r>
-        <w:rPr>
-          <w:rFonts w:ascii="Arial" w:hAnsi="Arial" w:cs="Arial"/>
-        </w:rPr>
-        <w:t xml:space="preserve"> estiverem preenchidos e válidos.</w:t>
+        <w:t>A matrícula só pode</w:t>
+      </w:r>
+      <w:r>
+        <w:rPr>
+          <w:rFonts w:ascii="Arial" w:hAnsi="Arial" w:cs="Arial"/>
+        </w:rPr>
+        <w:t xml:space="preserve"> ser efetivada quando: todos os dados obrigatórios do cadastro estiverem válidos, o aluno tiver selecionado um plano ativo, o pagamento da matrícula estiver confirmado. </w:t>
       </w:r>
     </w:p>
     <w:p>
@@ -2017,7 +2025,13 @@
         <w:rPr>
           <w:rFonts w:ascii="Arial" w:hAnsi="Arial" w:cs="Arial"/>
         </w:rPr>
-        <w:t>Quando o aluno tentar concluir a matrícula no site.</w:t>
+        <w:t>A</w:t>
+      </w:r>
+      <w:r>
+        <w:rPr>
+          <w:rFonts w:ascii="Arial" w:hAnsi="Arial" w:cs="Arial"/>
+        </w:rPr>
+        <w:t xml:space="preserve">o aluno tentar concluir a matrícula </w:t>
       </w:r>
     </w:p>
     <w:p>
@@ -2033,7 +2047,23 @@
           <w:b/>
           <w:bCs/>
         </w:rPr>
-        <w:t>Ação do sistema (se a regra for violada):</w:t>
+        <w:t>Ação do sistema (se a regra for</w:t>
+      </w:r>
+      <w:r>
+        <w:rPr>
+          <w:rFonts w:ascii="Arial" w:hAnsi="Arial" w:cs="Arial"/>
+          <w:b/>
+          <w:bCs/>
+        </w:rPr>
+        <w:t xml:space="preserve"> </w:t>
+      </w:r>
+      <w:r>
+        <w:rPr>
+          <w:rFonts w:ascii="Arial" w:hAnsi="Arial" w:cs="Arial"/>
+          <w:b/>
+          <w:bCs/>
+        </w:rPr>
+        <w:t>violada):</w:t>
       </w:r>
     </w:p>
     <w:p>
@@ -2050,7 +2080,7 @@
         <w:rPr>
           <w:rFonts w:ascii="Arial" w:hAnsi="Arial" w:cs="Arial"/>
         </w:rPr>
-        <w:t>O sistema deve impedir a conclusão da matrícula.</w:t>
+        <w:t xml:space="preserve">Impedir conclusão e indicar item pendente </w:t>
       </w:r>
     </w:p>
     <w:p>
@@ -2083,7 +2113,19 @@
         <w:rPr>
           <w:rFonts w:ascii="Arial" w:hAnsi="Arial" w:cs="Arial"/>
         </w:rPr>
-        <w:t>“Complete todos os dados obrigatórios do cadastro para finalizar a matrícula.”</w:t>
+        <w:t>“</w:t>
+      </w:r>
+      <w:r>
+        <w:rPr>
+          <w:rFonts w:ascii="Arial" w:hAnsi="Arial" w:cs="Arial"/>
+        </w:rPr>
+        <w:t>Não é possível concluir a matrícula</w:t>
+      </w:r>
+      <w:r>
+        <w:rPr>
+          <w:rFonts w:ascii="Arial" w:hAnsi="Arial" w:cs="Arial"/>
+        </w:rPr>
+        <w:t>”</w:t>
       </w:r>
     </w:p>
     <w:p>
@@ -2133,7 +2175,15 @@
           <w:b/>
           <w:bCs/>
         </w:rPr>
-        <w:t xml:space="preserve"> – Cancelamento encerra acesso do aluno</w:t>
+        <w:t xml:space="preserve"> – Cancelamento </w:t>
+      </w:r>
+      <w:r>
+        <w:rPr>
+          <w:rFonts w:ascii="Arial" w:hAnsi="Arial" w:cs="Arial"/>
+          <w:b/>
+          <w:bCs/>
+        </w:rPr>
+        <w:t>de matrícula:  acesso, aviso prévio e reembolso</w:t>
       </w:r>
     </w:p>
     <w:p>
@@ -2149,6 +2199,7 @@
           <w:b/>
           <w:bCs/>
         </w:rPr>
+        <w:lastRenderedPageBreak/>
         <w:t>Descrição:</w:t>
       </w:r>
       <w:r>
@@ -2156,7 +2207,45 @@
           <w:rFonts w:ascii="Arial" w:hAnsi="Arial" w:cs="Arial"/>
         </w:rPr>
         <w:br/>
-        <w:t>Ao cancelar uma matrícula, o aluno perde acesso às funcionalidades restritas do sistema.</w:t>
+        <w:t xml:space="preserve">Ao cancelar uma matrícula, o </w:t>
+      </w:r>
+      <w:r>
+        <w:rPr>
+          <w:rFonts w:ascii="Arial" w:hAnsi="Arial" w:cs="Arial"/>
+        </w:rPr>
+        <w:t xml:space="preserve">acesso </w:t>
+      </w:r>
+      <w:proofErr w:type="gramStart"/>
+      <w:r>
+        <w:rPr>
+          <w:rFonts w:ascii="Arial" w:hAnsi="Arial" w:cs="Arial"/>
+        </w:rPr>
+        <w:t>ás</w:t>
+      </w:r>
+      <w:proofErr w:type="gramEnd"/>
+      <w:r>
+        <w:rPr>
+          <w:rFonts w:ascii="Arial" w:hAnsi="Arial" w:cs="Arial"/>
+        </w:rPr>
+        <w:t xml:space="preserve"> áreas restritas é bloqueado imediatamente, o cancelamento exige aviso prévio de X dias, </w:t>
+      </w:r>
+      <w:r>
+        <w:rPr>
+          <w:rFonts w:ascii="Arial" w:hAnsi="Arial" w:cs="Arial"/>
+        </w:rPr>
+        <w:t>mensalidades já pagas e não usufruídas seguem a política de reembolso</w:t>
+      </w:r>
+      <w:r>
+        <w:rPr>
+          <w:rFonts w:ascii="Arial" w:hAnsi="Arial" w:cs="Arial"/>
+        </w:rPr>
+        <w:t xml:space="preserve"> e </w:t>
+      </w:r>
+      <w:r>
+        <w:rPr>
+          <w:rFonts w:ascii="Arial" w:hAnsi="Arial" w:cs="Arial"/>
+        </w:rPr>
+        <w:t>o histórico do aluno é mantido por X tempo, podendo ele se matricular novamente depois</w:t>
       </w:r>
     </w:p>
     <w:p>
@@ -2172,7 +2261,6 @@
           <w:b/>
           <w:bCs/>
         </w:rPr>
-        <w:lastRenderedPageBreak/>
         <w:t>Condição (quando aplicar):</w:t>
       </w:r>
     </w:p>
@@ -2190,7 +2278,13 @@
         <w:rPr>
           <w:rFonts w:ascii="Arial" w:hAnsi="Arial" w:cs="Arial"/>
         </w:rPr>
-        <w:t>Quando a matrícula for cancelada pela academia.</w:t>
+        <w:t>Q</w:t>
+      </w:r>
+      <w:r>
+        <w:rPr>
+          <w:rFonts w:ascii="Arial" w:hAnsi="Arial" w:cs="Arial"/>
+        </w:rPr>
+        <w:t>uando a academia ou o aluno solicita o cancelamento.</w:t>
       </w:r>
     </w:p>
     <w:p>
@@ -2223,7 +2317,13 @@
         <w:rPr>
           <w:rFonts w:ascii="Arial" w:hAnsi="Arial" w:cs="Arial"/>
         </w:rPr>
-        <w:t>O sistema deve bloquear o acesso do aluno às áreas restritas.</w:t>
+        <w:t xml:space="preserve">Ação se violada: </w:t>
+      </w:r>
+      <w:r>
+        <w:rPr>
+          <w:rFonts w:ascii="Arial" w:hAnsi="Arial" w:cs="Arial"/>
+        </w:rPr>
+        <w:t>(ex.: cancelamento fora do prazo de aviso) — bloquear ou aplicar multa, conforme definido.</w:t>
       </w:r>
     </w:p>
     <w:p>
@@ -2244,28 +2344,24 @@
     </w:p>
     <w:p>
       <w:pPr>
-        <w:numPr>
-          <w:ilvl w:val="0"/>
-          <w:numId w:val="35"/>
-        </w:numPr>
-        <w:rPr>
-          <w:rFonts w:ascii="Arial" w:hAnsi="Arial" w:cs="Arial"/>
-        </w:rPr>
-      </w:pPr>
-      <w:r>
-        <w:rPr>
-          <w:rFonts w:ascii="Arial" w:hAnsi="Arial" w:cs="Arial"/>
-        </w:rPr>
-        <w:t>“Sua matrícula foi cancelada e o acesso ao sistema foi encerrado.”</w:t>
-      </w:r>
-    </w:p>
-    <w:p>
-      <w:pPr>
         <w:ind w:left="360"/>
         <w:rPr>
           <w:rFonts w:ascii="Arial" w:hAnsi="Arial" w:cs="Arial"/>
         </w:rPr>
       </w:pPr>
+      <w:r>
+        <w:rPr>
+          <w:rFonts w:ascii="Arial" w:hAnsi="Arial" w:cs="Arial"/>
+        </w:rPr>
+        <w:t>•</w:t>
+      </w:r>
+      <w:r>
+        <w:rPr>
+          <w:rFonts w:ascii="Arial" w:hAnsi="Arial" w:cs="Arial"/>
+        </w:rPr>
+        <w:tab/>
+        <w:t>"Sua matrícula foi cancelada. [Detalhe sobre reembolso/aviso, se aplicável]."</w:t>
+      </w:r>
     </w:p>
     <w:p>
       <w:pPr>
@@ -2316,7 +2412,7 @@
           <w:b/>
           <w:bCs/>
         </w:rPr>
-        <w:t>RF001 – Cadastro de Aluno pelo Site</w:t>
+        <w:t xml:space="preserve">RF001 – Cadastro de Aluno </w:t>
       </w:r>
     </w:p>
     <w:p>
@@ -2339,7 +2435,12 @@
           <w:rFonts w:ascii="Arial" w:hAnsi="Arial" w:cs="Arial"/>
         </w:rPr>
         <w:br/>
-        <w:t>Permitir que o aluno realize seu cadastro na plataforma.</w:t>
+      </w:r>
+      <w:r>
+        <w:rPr>
+          <w:rFonts w:ascii="Arial" w:hAnsi="Arial" w:cs="Arial"/>
+        </w:rPr>
+        <w:t>Objetivo: Permitir que o aluno realize seu cadastro na plataforma.</w:t>
       </w:r>
     </w:p>
     <w:p>
@@ -2362,7 +2463,42 @@
           <w:rFonts w:ascii="Arial" w:hAnsi="Arial" w:cs="Arial"/>
         </w:rPr>
         <w:br/>
-        <w:t>O sistema deve permitir que novos alunos se cadastrem informando seus dados pessoais.</w:t>
+      </w:r>
+      <w:r>
+        <w:rPr>
+          <w:rFonts w:ascii="Arial" w:hAnsi="Arial" w:cs="Arial"/>
+        </w:rPr>
+        <w:t>O sistema deve permitir que novos alunos se cadastrem informando seus dados pessoais. O identificador do aluno (</w:t>
+      </w:r>
+      <w:proofErr w:type="spellStart"/>
+      <w:r>
+        <w:rPr>
+          <w:rFonts w:ascii="Arial" w:hAnsi="Arial" w:cs="Arial"/>
+        </w:rPr>
+        <w:t>id_aluno</w:t>
+      </w:r>
+      <w:proofErr w:type="spellEnd"/>
+      <w:r>
+        <w:rPr>
+          <w:rFonts w:ascii="Arial" w:hAnsi="Arial" w:cs="Arial"/>
+        </w:rPr>
+        <w:t xml:space="preserve">) é gerado automaticamente pelo banco de dados (chave primária </w:t>
+      </w:r>
+      <w:proofErr w:type="spellStart"/>
+      <w:proofErr w:type="gramStart"/>
+      <w:r>
+        <w:rPr>
+          <w:rFonts w:ascii="Arial" w:hAnsi="Arial" w:cs="Arial"/>
+        </w:rPr>
+        <w:t>auto-incremento</w:t>
+      </w:r>
+      <w:proofErr w:type="spellEnd"/>
+      <w:proofErr w:type="gramEnd"/>
+      <w:r>
+        <w:rPr>
+          <w:rFonts w:ascii="Arial" w:hAnsi="Arial" w:cs="Arial"/>
+        </w:rPr>
+        <w:t xml:space="preserve"> ou UUID), não sendo informado pelo usuário.</w:t>
       </w:r>
     </w:p>
     <w:p>
@@ -2536,25 +2672,28 @@
     </w:p>
     <w:p>
       <w:pPr>
-        <w:ind w:left="360"/>
-        <w:rPr>
-          <w:rFonts w:ascii="Arial" w:hAnsi="Arial" w:cs="Arial"/>
-        </w:rPr>
-      </w:pPr>
-      <w:r>
-        <w:rPr>
-          <w:rFonts w:ascii="Arial" w:hAnsi="Arial" w:cs="Arial"/>
-          <w:b/>
-          <w:bCs/>
-        </w:rPr>
+        <w:rPr>
+          <w:rFonts w:ascii="Arial" w:hAnsi="Arial" w:cs="Arial"/>
+          <w:b/>
+          <w:bCs/>
+        </w:rPr>
+      </w:pPr>
+      <w:r>
+        <w:rPr>
+          <w:rFonts w:ascii="Arial" w:hAnsi="Arial" w:cs="Arial"/>
+          <w:b/>
+          <w:bCs/>
+        </w:rPr>
+        <w:lastRenderedPageBreak/>
         <w:t>Processamento:</w:t>
       </w:r>
     </w:p>
     <w:p>
       <w:pPr>
+        <w:pStyle w:val="PargrafodaLista"/>
         <w:numPr>
           <w:ilvl w:val="0"/>
-          <w:numId w:val="2"/>
+          <w:numId w:val="37"/>
         </w:numPr>
         <w:rPr>
           <w:rFonts w:ascii="Arial" w:hAnsi="Arial" w:cs="Arial"/>
@@ -2564,14 +2703,15 @@
         <w:rPr>
           <w:rFonts w:ascii="Arial" w:hAnsi="Arial" w:cs="Arial"/>
         </w:rPr>
-        <w:t>Validar campos obrigatórios.</w:t>
-      </w:r>
-    </w:p>
-    <w:p>
-      <w:pPr>
+        <w:t>Validar formato e obrigatoriedade dos campos.</w:t>
+      </w:r>
+    </w:p>
+    <w:p>
+      <w:pPr>
+        <w:pStyle w:val="PargrafodaLista"/>
         <w:numPr>
           <w:ilvl w:val="0"/>
-          <w:numId w:val="2"/>
+          <w:numId w:val="37"/>
         </w:numPr>
         <w:rPr>
           <w:rFonts w:ascii="Arial" w:hAnsi="Arial" w:cs="Arial"/>
@@ -2581,14 +2721,15 @@
         <w:rPr>
           <w:rFonts w:ascii="Arial" w:hAnsi="Arial" w:cs="Arial"/>
         </w:rPr>
-        <w:t>Verificar se CPF ou e-mail já existem.</w:t>
-      </w:r>
-    </w:p>
-    <w:p>
-      <w:pPr>
+        <w:t>Verificar unicidade de CPF e e-mail (RN002).</w:t>
+      </w:r>
+    </w:p>
+    <w:p>
+      <w:pPr>
+        <w:pStyle w:val="PargrafodaLista"/>
         <w:numPr>
           <w:ilvl w:val="0"/>
-          <w:numId w:val="2"/>
+          <w:numId w:val="37"/>
         </w:numPr>
         <w:rPr>
           <w:rFonts w:ascii="Arial" w:hAnsi="Arial" w:cs="Arial"/>
@@ -2598,7 +2739,159 @@
         <w:rPr>
           <w:rFonts w:ascii="Arial" w:hAnsi="Arial" w:cs="Arial"/>
         </w:rPr>
-        <w:t>Salvar cadastro no banco.</w:t>
+        <w:t>Criptografar a senha antes de persistir (</w:t>
+      </w:r>
+      <w:proofErr w:type="spellStart"/>
+      <w:r>
+        <w:rPr>
+          <w:rFonts w:ascii="Arial" w:hAnsi="Arial" w:cs="Arial"/>
+        </w:rPr>
+        <w:t>hash</w:t>
+      </w:r>
+      <w:proofErr w:type="spellEnd"/>
+      <w:r>
+        <w:rPr>
+          <w:rFonts w:ascii="Arial" w:hAnsi="Arial" w:cs="Arial"/>
+        </w:rPr>
+        <w:t xml:space="preserve">, </w:t>
+      </w:r>
+      <w:proofErr w:type="spellStart"/>
+      <w:r>
+        <w:rPr>
+          <w:rFonts w:ascii="Arial" w:hAnsi="Arial" w:cs="Arial"/>
+        </w:rPr>
+        <w:t>ex</w:t>
+      </w:r>
+      <w:proofErr w:type="spellEnd"/>
+      <w:r>
+        <w:rPr>
+          <w:rFonts w:ascii="Arial" w:hAnsi="Arial" w:cs="Arial"/>
+        </w:rPr>
+        <w:t xml:space="preserve">: </w:t>
+      </w:r>
+      <w:proofErr w:type="spellStart"/>
+      <w:r>
+        <w:rPr>
+          <w:rFonts w:ascii="Arial" w:hAnsi="Arial" w:cs="Arial"/>
+        </w:rPr>
+        <w:t>bcrypt</w:t>
+      </w:r>
+      <w:proofErr w:type="spellEnd"/>
+      <w:r>
+        <w:rPr>
+          <w:rFonts w:ascii="Arial" w:hAnsi="Arial" w:cs="Arial"/>
+        </w:rPr>
+        <w:t>).</w:t>
+      </w:r>
+    </w:p>
+    <w:p>
+      <w:pPr>
+        <w:pStyle w:val="PargrafodaLista"/>
+        <w:numPr>
+          <w:ilvl w:val="0"/>
+          <w:numId w:val="37"/>
+        </w:numPr>
+        <w:rPr>
+          <w:rFonts w:ascii="Arial" w:hAnsi="Arial" w:cs="Arial"/>
+        </w:rPr>
+      </w:pPr>
+      <w:r>
+        <w:rPr>
+          <w:rFonts w:ascii="Arial" w:hAnsi="Arial" w:cs="Arial"/>
+        </w:rPr>
+        <w:t xml:space="preserve">Gerar </w:t>
+      </w:r>
+      <w:proofErr w:type="spellStart"/>
+      <w:r>
+        <w:rPr>
+          <w:rFonts w:ascii="Arial" w:hAnsi="Arial" w:cs="Arial"/>
+        </w:rPr>
+        <w:t>id_aluno</w:t>
+      </w:r>
+      <w:proofErr w:type="spellEnd"/>
+      <w:r>
+        <w:rPr>
+          <w:rFonts w:ascii="Arial" w:hAnsi="Arial" w:cs="Arial"/>
+        </w:rPr>
+        <w:t xml:space="preserve"> automaticamente.</w:t>
+      </w:r>
+    </w:p>
+    <w:p>
+      <w:pPr>
+        <w:pStyle w:val="PargrafodaLista"/>
+        <w:numPr>
+          <w:ilvl w:val="0"/>
+          <w:numId w:val="37"/>
+        </w:numPr>
+        <w:rPr>
+          <w:rFonts w:ascii="Arial" w:hAnsi="Arial" w:cs="Arial"/>
+        </w:rPr>
+      </w:pPr>
+      <w:r>
+        <w:rPr>
+          <w:rFonts w:ascii="Arial" w:hAnsi="Arial" w:cs="Arial"/>
+        </w:rPr>
+        <w:t xml:space="preserve">Retornar 201 </w:t>
+      </w:r>
+      <w:proofErr w:type="spellStart"/>
+      <w:r>
+        <w:rPr>
+          <w:rFonts w:ascii="Arial" w:hAnsi="Arial" w:cs="Arial"/>
+        </w:rPr>
+        <w:t>Created</w:t>
+      </w:r>
+      <w:proofErr w:type="spellEnd"/>
+      <w:r>
+        <w:rPr>
+          <w:rFonts w:ascii="Arial" w:hAnsi="Arial" w:cs="Arial"/>
+        </w:rPr>
+        <w:t xml:space="preserve"> em caso de sucesso, ou 400 </w:t>
+      </w:r>
+      <w:proofErr w:type="spellStart"/>
+      <w:r>
+        <w:rPr>
+          <w:rFonts w:ascii="Arial" w:hAnsi="Arial" w:cs="Arial"/>
+        </w:rPr>
+        <w:t>Bad</w:t>
+      </w:r>
+      <w:proofErr w:type="spellEnd"/>
+      <w:r>
+        <w:rPr>
+          <w:rFonts w:ascii="Arial" w:hAnsi="Arial" w:cs="Arial"/>
+        </w:rPr>
+        <w:t xml:space="preserve"> </w:t>
+      </w:r>
+      <w:proofErr w:type="spellStart"/>
+      <w:r>
+        <w:rPr>
+          <w:rFonts w:ascii="Arial" w:hAnsi="Arial" w:cs="Arial"/>
+        </w:rPr>
+        <w:t>Request</w:t>
+      </w:r>
+      <w:proofErr w:type="spellEnd"/>
+      <w:r>
+        <w:rPr>
+          <w:rFonts w:ascii="Arial" w:hAnsi="Arial" w:cs="Arial"/>
+        </w:rPr>
+        <w:t xml:space="preserve"> com mensagem de erro específica em caso de validação falha.</w:t>
+      </w:r>
+    </w:p>
+    <w:p>
+      <w:pPr>
+        <w:pStyle w:val="PargrafodaLista"/>
+        <w:numPr>
+          <w:ilvl w:val="0"/>
+          <w:numId w:val="37"/>
+        </w:numPr>
+        <w:rPr>
+          <w:rFonts w:ascii="Arial" w:hAnsi="Arial" w:cs="Arial"/>
+        </w:rPr>
+      </w:pPr>
+      <w:r>
+        <w:rPr>
+          <w:rFonts w:ascii="Arial" w:hAnsi="Arial" w:cs="Arial"/>
+        </w:rPr>
+        <w:t>Saídas: Confirmação de cadastro com dados do aluno (exceto senha) e status HTTP.</w:t>
       </w:r>
     </w:p>
     <w:p>
@@ -2631,42 +2924,7 @@
         <w:rPr>
           <w:rFonts w:ascii="Arial" w:hAnsi="Arial" w:cs="Arial"/>
         </w:rPr>
-        <w:lastRenderedPageBreak/>
-        <w:t>“Cadastro realizado com sucesso.”</w:t>
-      </w:r>
-    </w:p>
-    <w:p>
-      <w:pPr>
-        <w:numPr>
-          <w:ilvl w:val="0"/>
-          <w:numId w:val="3"/>
-        </w:numPr>
-        <w:rPr>
-          <w:rFonts w:ascii="Arial" w:hAnsi="Arial" w:cs="Arial"/>
-        </w:rPr>
-      </w:pPr>
-      <w:r>
-        <w:rPr>
-          <w:rFonts w:ascii="Arial" w:hAnsi="Arial" w:cs="Arial"/>
-        </w:rPr>
-        <w:t>“CPF informado já está cadastrado”</w:t>
-      </w:r>
-    </w:p>
-    <w:p>
-      <w:pPr>
-        <w:numPr>
-          <w:ilvl w:val="0"/>
-          <w:numId w:val="3"/>
-        </w:numPr>
-        <w:rPr>
-          <w:rFonts w:ascii="Arial" w:hAnsi="Arial" w:cs="Arial"/>
-        </w:rPr>
-      </w:pPr>
-      <w:r>
-        <w:rPr>
-          <w:rFonts w:ascii="Arial" w:hAnsi="Arial" w:cs="Arial"/>
-        </w:rPr>
-        <w:t>“E-mail informado já está cadastrado”</w:t>
+        <w:t>"Cadastro realizado com sucesso." (HTTP 201, junto com os dados do aluno cadastrado, exceto senha)</w:t>
       </w:r>
     </w:p>
     <w:p>
@@ -2699,12 +2957,32 @@
         <w:rPr>
           <w:rFonts w:ascii="Arial" w:hAnsi="Arial" w:cs="Arial"/>
         </w:rPr>
-        <w:t>Aluno registrado e apto a acessar o sistema.</w:t>
-      </w:r>
-    </w:p>
-    <w:p>
-      <w:pPr>
-        <w:ind w:left="360"/>
+        <w:t>Aluno registrado no sistema, com login habilitado.</w:t>
+      </w:r>
+    </w:p>
+    <w:p>
+      <w:pPr>
+        <w:numPr>
+          <w:ilvl w:val="0"/>
+          <w:numId w:val="4"/>
+        </w:numPr>
+        <w:rPr>
+          <w:rFonts w:ascii="Arial" w:hAnsi="Arial" w:cs="Arial"/>
+        </w:rPr>
+      </w:pPr>
+      <w:r>
+        <w:rPr>
+          <w:rFonts w:ascii="Arial" w:hAnsi="Arial" w:cs="Arial"/>
+        </w:rPr>
+        <w:t>Acesso às áreas restritas (treinos, aulas) só é liberado após conclusão da matrícula (RN002).</w:t>
+      </w:r>
+    </w:p>
+    <w:p>
+      <w:pPr>
+        <w:numPr>
+          <w:ilvl w:val="0"/>
+          <w:numId w:val="4"/>
+        </w:numPr>
         <w:rPr>
           <w:rFonts w:ascii="Arial" w:hAnsi="Arial" w:cs="Arial"/>
         </w:rPr>
@@ -2974,6 +3252,7 @@
         <w:rPr>
           <w:rFonts w:ascii="Arial" w:hAnsi="Arial" w:cs="Arial"/>
         </w:rPr>
+        <w:lastRenderedPageBreak/>
         <w:t xml:space="preserve">   </w:t>
       </w:r>
       <w:r>
@@ -3106,7 +3385,6 @@
         <w:rPr>
           <w:rFonts w:ascii="Arial" w:hAnsi="Arial" w:cs="Arial"/>
         </w:rPr>
-        <w:lastRenderedPageBreak/>
         <w:t>Buscar planos ativos.</w:t>
       </w:r>
     </w:p>
@@ -3450,6 +3728,7 @@
         <w:rPr>
           <w:rFonts w:ascii="Arial" w:hAnsi="Arial" w:cs="Arial"/>
         </w:rPr>
+        <w:lastRenderedPageBreak/>
         <w:t>Matrícula registrada.</w:t>
       </w:r>
     </w:p>
@@ -3560,7 +3839,6 @@
           <w:b/>
           <w:bCs/>
         </w:rPr>
-        <w:lastRenderedPageBreak/>
         <w:t>Entradas:</w:t>
       </w:r>
       <w:r>
@@ -3903,6 +4181,7 @@
           <w:b/>
           <w:bCs/>
         </w:rPr>
+        <w:lastRenderedPageBreak/>
         <w:t>Pós-condição:</w:t>
       </w:r>
     </w:p>
@@ -3996,7 +4275,6 @@
           <w:b/>
           <w:bCs/>
         </w:rPr>
-        <w:lastRenderedPageBreak/>
         <w:t>Objetivo:</w:t>
       </w:r>
       <w:r>
@@ -6021,6 +6299,119 @@
     </w:lvl>
   </w:abstractNum>
   <w:abstractNum w:abstractNumId="12" w15:restartNumberingAfterBreak="0">
+    <w:nsid w:val="2FE808FE"/>
+    <w:multiLevelType w:val="hybridMultilevel"/>
+    <w:tmpl w:val="389648B0"/>
+    <w:lvl w:ilvl="0" w:tplc="04160001">
+      <w:start w:val="1"/>
+      <w:numFmt w:val="bullet"/>
+      <w:lvlText w:val=""/>
+      <w:lvlJc w:val="left"/>
+      <w:pPr>
+        <w:ind w:left="1080" w:hanging="360"/>
+      </w:pPr>
+      <w:rPr>
+        <w:rFonts w:ascii="Symbol" w:hAnsi="Symbol" w:hint="default"/>
+      </w:rPr>
+    </w:lvl>
+    <w:lvl w:ilvl="1" w:tplc="04160003" w:tentative="1">
+      <w:start w:val="1"/>
+      <w:numFmt w:val="bullet"/>
+      <w:lvlText w:val="o"/>
+      <w:lvlJc w:val="left"/>
+      <w:pPr>
+        <w:ind w:left="1800" w:hanging="360"/>
+      </w:pPr>
+      <w:rPr>
+        <w:rFonts w:ascii="Courier New" w:hAnsi="Courier New" w:cs="Courier New" w:hint="default"/>
+      </w:rPr>
+    </w:lvl>
+    <w:lvl w:ilvl="2" w:tplc="04160005" w:tentative="1">
+      <w:start w:val="1"/>
+      <w:numFmt w:val="bullet"/>
+      <w:lvlText w:val=""/>
+      <w:lvlJc w:val="left"/>
+      <w:pPr>
+        <w:ind w:left="2520" w:hanging="360"/>
+      </w:pPr>
+      <w:rPr>
+        <w:rFonts w:ascii="Wingdings" w:hAnsi="Wingdings" w:hint="default"/>
+      </w:rPr>
+    </w:lvl>
+    <w:lvl w:ilvl="3" w:tplc="04160001" w:tentative="1">
+      <w:start w:val="1"/>
+      <w:numFmt w:val="bullet"/>
+      <w:lvlText w:val=""/>
+      <w:lvlJc w:val="left"/>
+      <w:pPr>
+        <w:ind w:left="3240" w:hanging="360"/>
+      </w:pPr>
+      <w:rPr>
+        <w:rFonts w:ascii="Symbol" w:hAnsi="Symbol" w:hint="default"/>
+      </w:rPr>
+    </w:lvl>
+    <w:lvl w:ilvl="4" w:tplc="04160003" w:tentative="1">
+      <w:start w:val="1"/>
+      <w:numFmt w:val="bullet"/>
+      <w:lvlText w:val="o"/>
+      <w:lvlJc w:val="left"/>
+      <w:pPr>
+        <w:ind w:left="3960" w:hanging="360"/>
+      </w:pPr>
+      <w:rPr>
+        <w:rFonts w:ascii="Courier New" w:hAnsi="Courier New" w:cs="Courier New" w:hint="default"/>
+      </w:rPr>
+    </w:lvl>
+    <w:lvl w:ilvl="5" w:tplc="04160005" w:tentative="1">
+      <w:start w:val="1"/>
+      <w:numFmt w:val="bullet"/>
+      <w:lvlText w:val=""/>
+      <w:lvlJc w:val="left"/>
+      <w:pPr>
+        <w:ind w:left="4680" w:hanging="360"/>
+      </w:pPr>
+      <w:rPr>
+        <w:rFonts w:ascii="Wingdings" w:hAnsi="Wingdings" w:hint="default"/>
+      </w:rPr>
+    </w:lvl>
+    <w:lvl w:ilvl="6" w:tplc="04160001" w:tentative="1">
+      <w:start w:val="1"/>
+      <w:numFmt w:val="bullet"/>
+      <w:lvlText w:val=""/>
+      <w:lvlJc w:val="left"/>
+      <w:pPr>
+        <w:ind w:left="5400" w:hanging="360"/>
+      </w:pPr>
+      <w:rPr>
+        <w:rFonts w:ascii="Symbol" w:hAnsi="Symbol" w:hint="default"/>
+      </w:rPr>
+    </w:lvl>
+    <w:lvl w:ilvl="7" w:tplc="04160003" w:tentative="1">
+      <w:start w:val="1"/>
+      <w:numFmt w:val="bullet"/>
+      <w:lvlText w:val="o"/>
+      <w:lvlJc w:val="left"/>
+      <w:pPr>
+        <w:ind w:left="6120" w:hanging="360"/>
+      </w:pPr>
+      <w:rPr>
+        <w:rFonts w:ascii="Courier New" w:hAnsi="Courier New" w:cs="Courier New" w:hint="default"/>
+      </w:rPr>
+    </w:lvl>
+    <w:lvl w:ilvl="8" w:tplc="04160005" w:tentative="1">
+      <w:start w:val="1"/>
+      <w:numFmt w:val="bullet"/>
+      <w:lvlText w:val=""/>
+      <w:lvlJc w:val="left"/>
+      <w:pPr>
+        <w:ind w:left="6840" w:hanging="360"/>
+      </w:pPr>
+      <w:rPr>
+        <w:rFonts w:ascii="Wingdings" w:hAnsi="Wingdings" w:hint="default"/>
+      </w:rPr>
+    </w:lvl>
+  </w:abstractNum>
+  <w:abstractNum w:abstractNumId="13" w15:restartNumberingAfterBreak="0">
     <w:nsid w:val="316705B0"/>
     <w:multiLevelType w:val="multilevel"/>
     <w:tmpl w:val="BDA29C06"/>
@@ -6169,7 +6560,7 @@
       </w:rPr>
     </w:lvl>
   </w:abstractNum>
-  <w:abstractNum w:abstractNumId="13" w15:restartNumberingAfterBreak="0">
+  <w:abstractNum w:abstractNumId="14" w15:restartNumberingAfterBreak="0">
     <w:nsid w:val="35DE53E1"/>
     <w:multiLevelType w:val="multilevel"/>
     <w:tmpl w:val="5894BD48"/>
@@ -6318,7 +6709,7 @@
       </w:rPr>
     </w:lvl>
   </w:abstractNum>
-  <w:abstractNum w:abstractNumId="14" w15:restartNumberingAfterBreak="0">
+  <w:abstractNum w:abstractNumId="15" w15:restartNumberingAfterBreak="0">
     <w:nsid w:val="36ED6CFC"/>
     <w:multiLevelType w:val="multilevel"/>
     <w:tmpl w:val="A4F498E4"/>
@@ -6467,7 +6858,7 @@
       </w:rPr>
     </w:lvl>
   </w:abstractNum>
-  <w:abstractNum w:abstractNumId="15" w15:restartNumberingAfterBreak="0">
+  <w:abstractNum w:abstractNumId="16" w15:restartNumberingAfterBreak="0">
     <w:nsid w:val="3B614787"/>
     <w:multiLevelType w:val="multilevel"/>
     <w:tmpl w:val="AC2EF62C"/>
@@ -6616,7 +7007,7 @@
       </w:rPr>
     </w:lvl>
   </w:abstractNum>
-  <w:abstractNum w:abstractNumId="16" w15:restartNumberingAfterBreak="0">
+  <w:abstractNum w:abstractNumId="17" w15:restartNumberingAfterBreak="0">
     <w:nsid w:val="3D286440"/>
     <w:multiLevelType w:val="multilevel"/>
     <w:tmpl w:val="86DA0312"/>
@@ -6765,7 +7156,7 @@
       </w:rPr>
     </w:lvl>
   </w:abstractNum>
-  <w:abstractNum w:abstractNumId="17" w15:restartNumberingAfterBreak="0">
+  <w:abstractNum w:abstractNumId="18" w15:restartNumberingAfterBreak="0">
     <w:nsid w:val="3F876857"/>
     <w:multiLevelType w:val="multilevel"/>
     <w:tmpl w:val="4A1223DA"/>
@@ -6914,7 +7305,7 @@
       </w:rPr>
     </w:lvl>
   </w:abstractNum>
-  <w:abstractNum w:abstractNumId="18" w15:restartNumberingAfterBreak="0">
+  <w:abstractNum w:abstractNumId="19" w15:restartNumberingAfterBreak="0">
     <w:nsid w:val="412E5361"/>
     <w:multiLevelType w:val="multilevel"/>
     <w:tmpl w:val="C8FAAA44"/>
@@ -7063,7 +7454,7 @@
       </w:rPr>
     </w:lvl>
   </w:abstractNum>
-  <w:abstractNum w:abstractNumId="19" w15:restartNumberingAfterBreak="0">
+  <w:abstractNum w:abstractNumId="20" w15:restartNumberingAfterBreak="0">
     <w:nsid w:val="414839B0"/>
     <w:multiLevelType w:val="multilevel"/>
     <w:tmpl w:val="A14093D6"/>
@@ -7212,7 +7603,7 @@
       </w:rPr>
     </w:lvl>
   </w:abstractNum>
-  <w:abstractNum w:abstractNumId="20" w15:restartNumberingAfterBreak="0">
+  <w:abstractNum w:abstractNumId="21" w15:restartNumberingAfterBreak="0">
     <w:nsid w:val="4D5035A6"/>
     <w:multiLevelType w:val="multilevel"/>
     <w:tmpl w:val="D3FAD660"/>
@@ -7361,7 +7752,120 @@
       </w:rPr>
     </w:lvl>
   </w:abstractNum>
-  <w:abstractNum w:abstractNumId="21" w15:restartNumberingAfterBreak="0">
+  <w:abstractNum w:abstractNumId="22" w15:restartNumberingAfterBreak="0">
+    <w:nsid w:val="527C1DD2"/>
+    <w:multiLevelType w:val="hybridMultilevel"/>
+    <w:tmpl w:val="686EA522"/>
+    <w:lvl w:ilvl="0" w:tplc="04160001">
+      <w:start w:val="1"/>
+      <w:numFmt w:val="bullet"/>
+      <w:lvlText w:val=""/>
+      <w:lvlJc w:val="left"/>
+      <w:pPr>
+        <w:ind w:left="720" w:hanging="360"/>
+      </w:pPr>
+      <w:rPr>
+        <w:rFonts w:ascii="Symbol" w:hAnsi="Symbol" w:hint="default"/>
+      </w:rPr>
+    </w:lvl>
+    <w:lvl w:ilvl="1" w:tplc="04160003" w:tentative="1">
+      <w:start w:val="1"/>
+      <w:numFmt w:val="bullet"/>
+      <w:lvlText w:val="o"/>
+      <w:lvlJc w:val="left"/>
+      <w:pPr>
+        <w:ind w:left="1440" w:hanging="360"/>
+      </w:pPr>
+      <w:rPr>
+        <w:rFonts w:ascii="Courier New" w:hAnsi="Courier New" w:cs="Courier New" w:hint="default"/>
+      </w:rPr>
+    </w:lvl>
+    <w:lvl w:ilvl="2" w:tplc="04160005" w:tentative="1">
+      <w:start w:val="1"/>
+      <w:numFmt w:val="bullet"/>
+      <w:lvlText w:val=""/>
+      <w:lvlJc w:val="left"/>
+      <w:pPr>
+        <w:ind w:left="2160" w:hanging="360"/>
+      </w:pPr>
+      <w:rPr>
+        <w:rFonts w:ascii="Wingdings" w:hAnsi="Wingdings" w:hint="default"/>
+      </w:rPr>
+    </w:lvl>
+    <w:lvl w:ilvl="3" w:tplc="04160001" w:tentative="1">
+      <w:start w:val="1"/>
+      <w:numFmt w:val="bullet"/>
+      <w:lvlText w:val=""/>
+      <w:lvlJc w:val="left"/>
+      <w:pPr>
+        <w:ind w:left="2880" w:hanging="360"/>
+      </w:pPr>
+      <w:rPr>
+        <w:rFonts w:ascii="Symbol" w:hAnsi="Symbol" w:hint="default"/>
+      </w:rPr>
+    </w:lvl>
+    <w:lvl w:ilvl="4" w:tplc="04160003" w:tentative="1">
+      <w:start w:val="1"/>
+      <w:numFmt w:val="bullet"/>
+      <w:lvlText w:val="o"/>
+      <w:lvlJc w:val="left"/>
+      <w:pPr>
+        <w:ind w:left="3600" w:hanging="360"/>
+      </w:pPr>
+      <w:rPr>
+        <w:rFonts w:ascii="Courier New" w:hAnsi="Courier New" w:cs="Courier New" w:hint="default"/>
+      </w:rPr>
+    </w:lvl>
+    <w:lvl w:ilvl="5" w:tplc="04160005" w:tentative="1">
+      <w:start w:val="1"/>
+      <w:numFmt w:val="bullet"/>
+      <w:lvlText w:val=""/>
+      <w:lvlJc w:val="left"/>
+      <w:pPr>
+        <w:ind w:left="4320" w:hanging="360"/>
+      </w:pPr>
+      <w:rPr>
+        <w:rFonts w:ascii="Wingdings" w:hAnsi="Wingdings" w:hint="default"/>
+      </w:rPr>
+    </w:lvl>
+    <w:lvl w:ilvl="6" w:tplc="04160001" w:tentative="1">
+      <w:start w:val="1"/>
+      <w:numFmt w:val="bullet"/>
+      <w:lvlText w:val=""/>
+      <w:lvlJc w:val="left"/>
+      <w:pPr>
+        <w:ind w:left="5040" w:hanging="360"/>
+      </w:pPr>
+      <w:rPr>
+        <w:rFonts w:ascii="Symbol" w:hAnsi="Symbol" w:hint="default"/>
+      </w:rPr>
+    </w:lvl>
+    <w:lvl w:ilvl="7" w:tplc="04160003" w:tentative="1">
+      <w:start w:val="1"/>
+      <w:numFmt w:val="bullet"/>
+      <w:lvlText w:val="o"/>
+      <w:lvlJc w:val="left"/>
+      <w:pPr>
+        <w:ind w:left="5760" w:hanging="360"/>
+      </w:pPr>
+      <w:rPr>
+        <w:rFonts w:ascii="Courier New" w:hAnsi="Courier New" w:cs="Courier New" w:hint="default"/>
+      </w:rPr>
+    </w:lvl>
+    <w:lvl w:ilvl="8" w:tplc="04160005" w:tentative="1">
+      <w:start w:val="1"/>
+      <w:numFmt w:val="bullet"/>
+      <w:lvlText w:val=""/>
+      <w:lvlJc w:val="left"/>
+      <w:pPr>
+        <w:ind w:left="6480" w:hanging="360"/>
+      </w:pPr>
+      <w:rPr>
+        <w:rFonts w:ascii="Wingdings" w:hAnsi="Wingdings" w:hint="default"/>
+      </w:rPr>
+    </w:lvl>
+  </w:abstractNum>
+  <w:abstractNum w:abstractNumId="23" w15:restartNumberingAfterBreak="0">
     <w:nsid w:val="53B76DD5"/>
     <w:multiLevelType w:val="multilevel"/>
     <w:tmpl w:val="CAD49D2C"/>
@@ -7510,7 +8014,7 @@
       </w:rPr>
     </w:lvl>
   </w:abstractNum>
-  <w:abstractNum w:abstractNumId="22" w15:restartNumberingAfterBreak="0">
+  <w:abstractNum w:abstractNumId="24" w15:restartNumberingAfterBreak="0">
     <w:nsid w:val="53F34716"/>
     <w:multiLevelType w:val="multilevel"/>
     <w:tmpl w:val="B972BA06"/>
@@ -7659,7 +8163,7 @@
       </w:rPr>
     </w:lvl>
   </w:abstractNum>
-  <w:abstractNum w:abstractNumId="23" w15:restartNumberingAfterBreak="0">
+  <w:abstractNum w:abstractNumId="25" w15:restartNumberingAfterBreak="0">
     <w:nsid w:val="54D8335E"/>
     <w:multiLevelType w:val="multilevel"/>
     <w:tmpl w:val="D93C882A"/>
@@ -7808,7 +8312,7 @@
       </w:rPr>
     </w:lvl>
   </w:abstractNum>
-  <w:abstractNum w:abstractNumId="24" w15:restartNumberingAfterBreak="0">
+  <w:abstractNum w:abstractNumId="26" w15:restartNumberingAfterBreak="0">
     <w:nsid w:val="5A3441DE"/>
     <w:multiLevelType w:val="multilevel"/>
     <w:tmpl w:val="4672F4BA"/>
@@ -7957,7 +8461,7 @@
       </w:rPr>
     </w:lvl>
   </w:abstractNum>
-  <w:abstractNum w:abstractNumId="25" w15:restartNumberingAfterBreak="0">
+  <w:abstractNum w:abstractNumId="27" w15:restartNumberingAfterBreak="0">
     <w:nsid w:val="5EAC33F1"/>
     <w:multiLevelType w:val="multilevel"/>
     <w:tmpl w:val="D56C5112"/>
@@ -8106,7 +8610,7 @@
       </w:rPr>
     </w:lvl>
   </w:abstractNum>
-  <w:abstractNum w:abstractNumId="26" w15:restartNumberingAfterBreak="0">
+  <w:abstractNum w:abstractNumId="28" w15:restartNumberingAfterBreak="0">
     <w:nsid w:val="5F2F4D92"/>
     <w:multiLevelType w:val="multilevel"/>
     <w:tmpl w:val="2CA8954C"/>
@@ -8255,7 +8759,7 @@
       </w:rPr>
     </w:lvl>
   </w:abstractNum>
-  <w:abstractNum w:abstractNumId="27" w15:restartNumberingAfterBreak="0">
+  <w:abstractNum w:abstractNumId="29" w15:restartNumberingAfterBreak="0">
     <w:nsid w:val="632D0839"/>
     <w:multiLevelType w:val="multilevel"/>
     <w:tmpl w:val="25F47F00"/>
@@ -8404,7 +8908,7 @@
       </w:rPr>
     </w:lvl>
   </w:abstractNum>
-  <w:abstractNum w:abstractNumId="28" w15:restartNumberingAfterBreak="0">
+  <w:abstractNum w:abstractNumId="30" w15:restartNumberingAfterBreak="0">
     <w:nsid w:val="642659E4"/>
     <w:multiLevelType w:val="multilevel"/>
     <w:tmpl w:val="9588EE42"/>
@@ -8553,7 +9057,7 @@
       </w:rPr>
     </w:lvl>
   </w:abstractNum>
-  <w:abstractNum w:abstractNumId="29" w15:restartNumberingAfterBreak="0">
+  <w:abstractNum w:abstractNumId="31" w15:restartNumberingAfterBreak="0">
     <w:nsid w:val="65CA38BE"/>
     <w:multiLevelType w:val="multilevel"/>
     <w:tmpl w:val="32D0A900"/>
@@ -8702,7 +9206,7 @@
       </w:rPr>
     </w:lvl>
   </w:abstractNum>
-  <w:abstractNum w:abstractNumId="30" w15:restartNumberingAfterBreak="0">
+  <w:abstractNum w:abstractNumId="32" w15:restartNumberingAfterBreak="0">
     <w:nsid w:val="66454336"/>
     <w:multiLevelType w:val="multilevel"/>
     <w:tmpl w:val="3C5C17D0"/>
@@ -8851,7 +9355,7 @@
       </w:rPr>
     </w:lvl>
   </w:abstractNum>
-  <w:abstractNum w:abstractNumId="31" w15:restartNumberingAfterBreak="0">
+  <w:abstractNum w:abstractNumId="33" w15:restartNumberingAfterBreak="0">
     <w:nsid w:val="694E11BA"/>
     <w:multiLevelType w:val="multilevel"/>
     <w:tmpl w:val="827AEF4A"/>
@@ -9000,7 +9504,7 @@
       </w:rPr>
     </w:lvl>
   </w:abstractNum>
-  <w:abstractNum w:abstractNumId="32" w15:restartNumberingAfterBreak="0">
+  <w:abstractNum w:abstractNumId="34" w15:restartNumberingAfterBreak="0">
     <w:nsid w:val="739E3AA3"/>
     <w:multiLevelType w:val="multilevel"/>
     <w:tmpl w:val="90B63A52"/>
@@ -9149,7 +9653,7 @@
       </w:rPr>
     </w:lvl>
   </w:abstractNum>
-  <w:abstractNum w:abstractNumId="33" w15:restartNumberingAfterBreak="0">
+  <w:abstractNum w:abstractNumId="35" w15:restartNumberingAfterBreak="0">
     <w:nsid w:val="75504021"/>
     <w:multiLevelType w:val="multilevel"/>
     <w:tmpl w:val="E838298A"/>
@@ -9298,7 +9802,7 @@
       </w:rPr>
     </w:lvl>
   </w:abstractNum>
-  <w:abstractNum w:abstractNumId="34" w15:restartNumberingAfterBreak="0">
+  <w:abstractNum w:abstractNumId="36" w15:restartNumberingAfterBreak="0">
     <w:nsid w:val="794F13E6"/>
     <w:multiLevelType w:val="multilevel"/>
     <w:tmpl w:val="0EEA91BC"/>
@@ -9451,43 +9955,43 @@
     <w:abstractNumId w:val="4"/>
   </w:num>
   <w:num w:numId="2" w16cid:durableId="179659075">
-    <w:abstractNumId w:val="22"/>
+    <w:abstractNumId w:val="24"/>
   </w:num>
   <w:num w:numId="3" w16cid:durableId="674459797">
     <w:abstractNumId w:val="6"/>
   </w:num>
   <w:num w:numId="4" w16cid:durableId="59983452">
-    <w:abstractNumId w:val="28"/>
+    <w:abstractNumId w:val="30"/>
   </w:num>
   <w:num w:numId="5" w16cid:durableId="965504765">
-    <w:abstractNumId w:val="34"/>
+    <w:abstractNumId w:val="36"/>
   </w:num>
   <w:num w:numId="6" w16cid:durableId="1750537611">
-    <w:abstractNumId w:val="14"/>
+    <w:abstractNumId w:val="15"/>
   </w:num>
   <w:num w:numId="7" w16cid:durableId="1997109213">
     <w:abstractNumId w:val="11"/>
   </w:num>
   <w:num w:numId="8" w16cid:durableId="163516022">
-    <w:abstractNumId w:val="16"/>
+    <w:abstractNumId w:val="17"/>
   </w:num>
   <w:num w:numId="9" w16cid:durableId="2079552230">
-    <w:abstractNumId w:val="33"/>
+    <w:abstractNumId w:val="35"/>
   </w:num>
   <w:num w:numId="10" w16cid:durableId="1648705954">
     <w:abstractNumId w:val="8"/>
   </w:num>
   <w:num w:numId="11" w16cid:durableId="198277582">
-    <w:abstractNumId w:val="12"/>
+    <w:abstractNumId w:val="13"/>
   </w:num>
   <w:num w:numId="12" w16cid:durableId="2045448505">
     <w:abstractNumId w:val="5"/>
   </w:num>
   <w:num w:numId="13" w16cid:durableId="944843259">
-    <w:abstractNumId w:val="31"/>
+    <w:abstractNumId w:val="33"/>
   </w:num>
   <w:num w:numId="14" w16cid:durableId="1183326567">
-    <w:abstractNumId w:val="15"/>
+    <w:abstractNumId w:val="16"/>
   </w:num>
   <w:num w:numId="15" w16cid:durableId="1386639952">
     <w:abstractNumId w:val="3"/>
@@ -9502,55 +10006,61 @@
     <w:abstractNumId w:val="7"/>
   </w:num>
   <w:num w:numId="19" w16cid:durableId="615714745">
-    <w:abstractNumId w:val="21"/>
+    <w:abstractNumId w:val="23"/>
   </w:num>
   <w:num w:numId="20" w16cid:durableId="1543785871">
-    <w:abstractNumId w:val="25"/>
+    <w:abstractNumId w:val="27"/>
   </w:num>
   <w:num w:numId="21" w16cid:durableId="2079590892">
     <w:abstractNumId w:val="10"/>
   </w:num>
   <w:num w:numId="22" w16cid:durableId="296683407">
-    <w:abstractNumId w:val="19"/>
+    <w:abstractNumId w:val="20"/>
   </w:num>
   <w:num w:numId="23" w16cid:durableId="1412776104">
     <w:abstractNumId w:val="2"/>
   </w:num>
   <w:num w:numId="24" w16cid:durableId="1257514515">
-    <w:abstractNumId w:val="18"/>
+    <w:abstractNumId w:val="19"/>
   </w:num>
   <w:num w:numId="25" w16cid:durableId="1683848566">
-    <w:abstractNumId w:val="27"/>
+    <w:abstractNumId w:val="29"/>
   </w:num>
   <w:num w:numId="26" w16cid:durableId="1788697681">
-    <w:abstractNumId w:val="30"/>
+    <w:abstractNumId w:val="32"/>
   </w:num>
   <w:num w:numId="27" w16cid:durableId="143737004">
-    <w:abstractNumId w:val="24"/>
+    <w:abstractNumId w:val="26"/>
   </w:num>
   <w:num w:numId="28" w16cid:durableId="771358924">
-    <w:abstractNumId w:val="23"/>
+    <w:abstractNumId w:val="25"/>
   </w:num>
   <w:num w:numId="29" w16cid:durableId="320694431">
-    <w:abstractNumId w:val="13"/>
+    <w:abstractNumId w:val="14"/>
   </w:num>
   <w:num w:numId="30" w16cid:durableId="1942764396">
-    <w:abstractNumId w:val="32"/>
+    <w:abstractNumId w:val="34"/>
   </w:num>
   <w:num w:numId="31" w16cid:durableId="159002411">
-    <w:abstractNumId w:val="26"/>
+    <w:abstractNumId w:val="28"/>
   </w:num>
   <w:num w:numId="32" w16cid:durableId="1438061911">
-    <w:abstractNumId w:val="20"/>
+    <w:abstractNumId w:val="21"/>
   </w:num>
   <w:num w:numId="33" w16cid:durableId="1881700187">
-    <w:abstractNumId w:val="29"/>
+    <w:abstractNumId w:val="31"/>
   </w:num>
   <w:num w:numId="34" w16cid:durableId="1882788634">
-    <w:abstractNumId w:val="17"/>
+    <w:abstractNumId w:val="18"/>
   </w:num>
   <w:num w:numId="35" w16cid:durableId="288973761">
     <w:abstractNumId w:val="0"/>
+  </w:num>
+  <w:num w:numId="36" w16cid:durableId="1648631744">
+    <w:abstractNumId w:val="12"/>
+  </w:num>
+  <w:num w:numId="37" w16cid:durableId="751896484">
+    <w:abstractNumId w:val="22"/>
   </w:num>
   <w:numIdMacAtCleanup w:val="35"/>
 </w:numbering>
@@ -10159,7 +10669,6 @@
   <w:style w:type="character" w:default="1" w:styleId="Fontepargpadro">
     <w:name w:val="Default Paragraph Font"/>
     <w:uiPriority w:val="1"/>
-    <w:semiHidden/>
     <w:unhideWhenUsed/>
   </w:style>
   <w:style w:type="table" w:default="1" w:styleId="Tabelanormal">

</xml_diff>